<commit_message>
Clarify sampled CFR policy wording
</commit_message>
<xml_diff>
--- a/docs/polished/applied-focus/applied-focus.docx
+++ b/docs/polished/applied-focus/applied-focus.docx
@@ -235,7 +235,7 @@
         <w:pStyle w:val="FirstParagraph"/>
       </w:pPr>
       <w:r>
-        <w:t xml:space="preserve">Nash equilibrium is a strategy profile where no player can improve by unilaterally changing strategy. It is a central concept in game theory, but it is also easy to overclaim. A project can use CFR-style methods without proving that the final policy is a Nash equilibrium.</w:t>
+        <w:t xml:space="preserve">Nash equilibrium is a strategy profile where no player can improve by unilaterally changing strategy. It is a central concept in game theory, but it is also easy to overclaim. A project can use sampled CFR+ methods without proving that the final policy is a Nash equilibrium.</w:t>
       </w:r>
     </w:p>
     <w:p>
@@ -259,7 +259,7 @@
         <w:pStyle w:val="BodyText"/>
       </w:pPr>
       <w:r>
-        <w:t xml:space="preserve">The public demo uses CFR-style training on a simplified game abstraction. That wording is intentional. The current artifact demonstrates the pipeline and measured behavior, but it does not claim a formal equilibrium proof.</w:t>
+        <w:t xml:space="preserve">The public demo uses sampled CFR+ training on a simplified game abstraction. That wording is intentional. The current artifact demonstrates the pipeline and measured behavior, but it does not claim a formal equilibrium proof.</w:t>
       </w:r>
     </w:p>
     <w:bookmarkEnd w:id="24"/>
@@ -517,7 +517,7 @@
         <w:pStyle w:val="FirstParagraph"/>
       </w:pPr>
       <w:r>
-        <w:t xml:space="preserve">The strongest part of the public project is the evaluation story. The updated count-aware policy improved benchmark average win rate from 45.3 percent to 73.0 percent across seeded opponent profiles. That is useful evidence that the policy became better against the benchmark suite.</w:t>
+        <w:t xml:space="preserve">The strongest part of the public project is the evaluation story. The updated policy conditions on remaining dice counts and private dice, improving benchmark average win rate from 45.3 percent to 73.0 percent across seeded opponent profiles. That is useful evidence that the policy became better against the benchmark suite.</w:t>
       </w:r>
     </w:p>
     <w:p>
@@ -559,7 +559,7 @@
         <w:pStyle w:val="BodyText"/>
       </w:pPr>
       <w:r>
-        <w:t xml:space="preserve">This is an end-to-end imperfect-information game-solving lab built around a simplified Liar’s Dice challenge game. It includes Python CFR-style self-play, policy export, deterministic evaluation, a playable TypeScript demo, a classic rules comparison, and a curated paper archive.</w:t>
+        <w:t xml:space="preserve">This is an end-to-end imperfect-information game-solving lab built around a simplified Liar’s Dice challenge game. It includes Python sampled CFR+ self-play, policy export, deterministic evaluation, a playable TypeScript demo, a classic rules comparison, and a curated paper archive.</w:t>
       </w:r>
     </w:p>
     <w:p>
@@ -617,7 +617,7 @@
         <w:pStyle w:val="BodyText"/>
       </w:pPr>
       <w:r>
-        <w:t xml:space="preserve">CFR-style training is useful because regret minimization gives a principled way to update policies over repeated self-play.</w:t>
+        <w:t xml:space="preserve">Sampled CFR+ training is useful because regret minimization gives a principled way to update policies over repeated self-play.</w:t>
       </w:r>
     </w:p>
     <w:p>

</xml_diff>